<commit_message>
chore: add quality tooling and the ci merge gate, steps 0.4-0.5 (#11)
ESLint, Prettier, Husky and commitlint from the repository root; a reusable ci.yml with four required checks called by pr.yml and main.yml; Playwright E2E on main and nightly; the 80% coverage floor measured over both backend suites together. Branch protection on main is active and was proved to block a red check.

Spec: docs/features/phase-0-foundation.md

Co-Authored-By: Claude Opus 5.5 <noreply@anthropic.com>
</commit_message>
<xml_diff>
--- a/docs/tests.docx
+++ b/docs/tests.docx
@@ -613,10 +613,7 @@
         <w:rPr>
           <w:b/>
         </w:rPr>
-        <w:t>80% line coverage is enforced in CI</w:t>
-      </w:r>
-      <w:r>
-        <w:t xml:space="preserve"> via the Vitest coverage reporter (v8 provider). Falling below it fails the build and blocks the merge.</w:t>
+        <w:t>80% line coverage is enforced in CI via the Vitest coverage reporter (v8 provider). Falling below it fails the build and blocks the merge. It is measured over every suite that exercises a package, not one of them — see §4.1.</w:t>
       </w:r>
     </w:p>
     <w:p>
@@ -892,14 +889,8 @@
             <w:tcW w:type="dxa" w:w="2880"/>
           </w:tcPr>
           <w:p>
-            <w:r/>
             <w:r>
-              <w:rPr>
-                <w:rFonts w:ascii="Consolas" w:hAnsi="Consolas"/>
-                <w:color w:val="A03030"/>
-                <w:sz w:val="19"/>
-              </w:rPr>
-              <w:t>vitest run --coverage</w:t>
+              <w:t>npm run test:unit</w:t>
             </w:r>
           </w:p>
         </w:tc>
@@ -908,9 +899,8 @@
             <w:tcW w:type="dxa" w:w="2880"/>
           </w:tcPr>
           <w:p>
-            <w:r/>
             <w:r>
-              <w:t>Unit tests, both packages, with the 80% floor applied</w:t>
+              <w:t>Unit tests, both packages. The frontend's 80% floor is applied here, because the frontend has a single suite</w:t>
             </w:r>
           </w:p>
         </w:tc>
@@ -937,14 +927,8 @@
             <w:tcW w:type="dxa" w:w="2880"/>
           </w:tcPr>
           <w:p>
-            <w:r/>
             <w:r>
-              <w:rPr>
-                <w:rFonts w:ascii="Consolas" w:hAnsi="Consolas"/>
-                <w:color w:val="A03030"/>
-                <w:sz w:val="19"/>
-              </w:rPr>
-              <w:t>vitest run --config integration</w:t>
+              <w:t>npm run test:integration + npm run test:coverage</w:t>
             </w:r>
           </w:p>
         </w:tc>
@@ -953,31 +937,8 @@
             <w:tcW w:type="dxa" w:w="2880"/>
           </w:tcPr>
           <w:p>
-            <w:r/>
             <w:r>
-              <w:t xml:space="preserve">Supertest against a </w:t>
-            </w:r>
-            <w:r>
-              <w:rPr>
-                <w:rFonts w:ascii="Consolas" w:hAnsi="Consolas"/>
-                <w:color w:val="A03030"/>
-                <w:sz w:val="19"/>
-              </w:rPr>
-              <w:t>postgres:16</w:t>
-            </w:r>
-            <w:r>
-              <w:t xml:space="preserve"> service container running </w:t>
-            </w:r>
-            <w:r>
-              <w:rPr>
-                <w:rFonts w:ascii="Consolas" w:hAnsi="Consolas"/>
-                <w:color w:val="A03030"/>
-                <w:sz w:val="19"/>
-              </w:rPr>
-              <w:t>music_app_test_db</w:t>
-            </w:r>
-            <w:r>
-              <w:t>, freshly migrated</w:t>
+              <w:t>Supertest against a postgres:16 service container running music_app_test_db, freshly migrated — followed by the backend’s 80% floor, measured over both backend suites together</w:t>
             </w:r>
           </w:p>
         </w:tc>
@@ -996,6 +957,11 @@
       </w:r>
       <w:r>
         <w:t>, so the feedback loop stays fast enough to actually use.</w:t>
+      </w:r>
+    </w:p>
+    <w:p>
+      <w:r>
+        <w:t>Why the backend’s floor is measured in the integration job rather than the unit job. The backend’s two suites run separately and deliberately so: they have very different costs, and only one of them needs a database. But coverage measured over one suite alone misrepresents the other — app.ts, the middleware and the route files are fully exercised by Supertest and report 0% under the unit config. A floor applied to that number would fail the build on correct code, and the tempting way out, excluding those files, is precisely the gaming §3.6 forbids. So the gate runs both suites in one pass, in the job that already has Postgres, through backend/vitest.coverage.config.ts. The frontend has one suite and needs none of this.</w:t>
       </w:r>
     </w:p>
     <w:p>

</xml_diff>

<commit_message>
feat(e2e): add the google stand-in and phase 1 golden-loop specs
Co-Authored-By: Claude Opus 5.5 <noreply@anthropic.com>
</commit_message>
<xml_diff>
--- a/docs/tests.docx
+++ b/docs/tests.docx
@@ -513,6 +513,14 @@
       </w:pPr>
       <w:r>
         <w:t>If testing the route that uses your Playwright scraper, mock the generateUniversalLinks service so it instantly returns fake links instead of actually booting up a headless browser during the test. (Save the real browser interaction for your E2E tests).</w:t>
+      </w:r>
+    </w:p>
+    <w:p>
+      <w:pPr>
+        <w:pStyle w:val="ListBullet"/>
+      </w:pPr>
+      <w:r>
+        <w:t>E2E cannot sign in with a real Google account (automation is blocked, and it would need a real password in CI). It uses a Google stand-in instead: Playwright replaces Google's sign-in script with a stub whose button returns an ID token signed with a throwaway key committed in e2e/fixtures/, and the API, started with E2E_GOOGLE_PUBLIC_KEY, verifies that token with the same checks it applies to Google's (signature, audience, issuer, expiry). Everything after verification is the real code path. The API refuses to start with E2E_GOOGLE_PUBLIC_KEY set in production, and a unit test proves it. Detail: docs/features/auth-flow-e2e.md.</w:t>
       </w:r>
     </w:p>
     <w:p>

</xml_diff>